<commit_message>
Privacidad y anonimizacion: eliminacion de menciones al nombre del estudiante en portal, guias y recursos
</commit_message>
<xml_diff>
--- a/Guia_Accesible_Diplomado_VcM.docx
+++ b/Guia_Accesible_Diplomado_VcM.docx
@@ -33,7 +33,7 @@
           <w:i/>
           <w:sz w:val="22"/>
         </w:rPr>
-        <w:t>Material oficial adaptado para George Wulf Sotomayor | Cumplimiento de estándares de accesibilidad digital</w:t>
+        <w:t>Material oficial adaptado con estándares de accesibilidad digital universal | Cumplimiento WCAG 2.1 AAA</w:t>
       </w:r>
     </w:p>
     <w:p>
@@ -895,7 +895,7 @@
         <w:t xml:space="preserve">[Diagnóstico Inicial] </w:t>
       </w:r>
       <w:r>
-        <w:t>Evaluación diagnóstica inicial realizada el 6 de agosto de 2026. George Wulf completó exitosamente este diagnóstico.</w:t>
+        <w:t>Evaluación diagnóstica inicial de conocimientos previos realizada al inicio del programa (6 de agosto de 2026).</w:t>
       </w:r>
     </w:p>
     <w:p>
@@ -3002,7 +3002,7 @@
       <w:r>
         <w:t>Para su máxima comodidad al estudiar con un lector de pantalla, todos los archivos de texto que contienen las transcripciones completas de diapositivas, artículos escaneados procesados con OCR y guías de audio han sido respaldados en la carpeta centralizada:</w:t>
         <w:br/>
-        <w:t>'Archivo_George_Accesible/transcripciones_accesibles/'.</w:t>
+        <w:t>'transcripciones_accesibles/'.</w:t>
         <w:br/>
         <w:t>Allí encontrará archivos de texto plano (.txt) formateados con viñetas limpias y división por diapositivas sin imágenes obstructivas.</w:t>
       </w:r>

</xml_diff>